<commit_message>
docker - container file updated
</commit_message>
<xml_diff>
--- a/Docker/4-container.docx
+++ b/Docker/4-container.docx
@@ -2023,10 +2023,22 @@
       <w:r>
         <w:rPr>
           <w:rFonts w:asciiTheme="majorBidi" w:hAnsiTheme="majorBidi" w:cstheme="majorBidi"/>
-          <w:sz w:val="28"/>
-          <w:szCs w:val="28"/>
-        </w:rPr>
-        <w:t xml:space="preserve">-d → detached mode. Runs container in background. Without this, terminal attaches to container. Example: </w:t>
+          <w:b/>
+          <w:bCs/>
+          <w:i/>
+          <w:iCs/>
+          <w:sz w:val="28"/>
+          <w:szCs w:val="28"/>
+        </w:rPr>
+        <w:t>-d</w:t>
+      </w:r>
+      <w:r>
+        <w:rPr>
+          <w:rFonts w:asciiTheme="majorBidi" w:hAnsiTheme="majorBidi" w:cstheme="majorBidi"/>
+          <w:sz w:val="28"/>
+          <w:szCs w:val="28"/>
+        </w:rPr>
+        <w:t xml:space="preserve"> → detached mode. Runs container in background. Without this, terminal attaches to container. Example: </w:t>
       </w:r>
       <w:r>
         <w:rPr>
@@ -2059,10 +2071,22 @@
       <w:r>
         <w:rPr>
           <w:rFonts w:asciiTheme="majorBidi" w:hAnsiTheme="majorBidi" w:cstheme="majorBidi"/>
-          <w:sz w:val="28"/>
-          <w:szCs w:val="28"/>
-        </w:rPr>
-        <w:t xml:space="preserve">--name → assign name. Example: </w:t>
+          <w:b/>
+          <w:bCs/>
+          <w:i/>
+          <w:iCs/>
+          <w:sz w:val="28"/>
+          <w:szCs w:val="28"/>
+        </w:rPr>
+        <w:t>--name</w:t>
+      </w:r>
+      <w:r>
+        <w:rPr>
+          <w:rFonts w:asciiTheme="majorBidi" w:hAnsiTheme="majorBidi" w:cstheme="majorBidi"/>
+          <w:sz w:val="28"/>
+          <w:szCs w:val="28"/>
+        </w:rPr>
+        <w:t xml:space="preserve"> → assign name. Example: </w:t>
       </w:r>
       <w:r>
         <w:rPr>
@@ -2095,10 +2119,22 @@
       <w:r>
         <w:rPr>
           <w:rFonts w:asciiTheme="majorBidi" w:hAnsiTheme="majorBidi" w:cstheme="majorBidi"/>
-          <w:sz w:val="28"/>
-          <w:szCs w:val="28"/>
-        </w:rPr>
-        <w:t xml:space="preserve">-it → interactive mode. Example: </w:t>
+          <w:b/>
+          <w:bCs/>
+          <w:i/>
+          <w:iCs/>
+          <w:sz w:val="28"/>
+          <w:szCs w:val="28"/>
+        </w:rPr>
+        <w:t>-it</w:t>
+      </w:r>
+      <w:r>
+        <w:rPr>
+          <w:rFonts w:asciiTheme="majorBidi" w:hAnsiTheme="majorBidi" w:cstheme="majorBidi"/>
+          <w:sz w:val="28"/>
+          <w:szCs w:val="28"/>
+        </w:rPr>
+        <w:t xml:space="preserve"> → interactive mode. Example: </w:t>
       </w:r>
       <w:r>
         <w:rPr>
@@ -2178,6 +2214,7 @@
           <w:ilvl w:val="1"/>
           <w:numId w:val="8"/>
         </w:numPr>
+        <w:spacing w:after="0"/>
         <w:ind w:left="720"/>
         <w:jc w:val="both"/>
         <w:rPr>
@@ -3127,7 +3164,6 @@
           <w:sz w:val="28"/>
           <w:szCs w:val="28"/>
         </w:rPr>
-        <w:lastRenderedPageBreak/>
         <w:t>Memory limit</w:t>
       </w:r>
       <w:r>
@@ -3165,6 +3201,7 @@
           <w:sz w:val="28"/>
           <w:szCs w:val="28"/>
         </w:rPr>
+        <w:lastRenderedPageBreak/>
         <w:t>--memory=512m</w:t>
       </w:r>
       <w:r>
@@ -3739,7 +3776,15 @@
           <w:sz w:val="28"/>
           <w:szCs w:val="28"/>
         </w:rPr>
-        <w:t>this restricts how much data the container can write to its container layer (the thin writable layer on top of the image). If the container tries to exceed 5GB, writes will fail with “no space left on device”.</w:t>
+        <w:t>T</w:t>
+      </w:r>
+      <w:r>
+        <w:rPr>
+          <w:rFonts w:asciiTheme="majorBidi" w:hAnsiTheme="majorBidi" w:cstheme="majorBidi"/>
+          <w:sz w:val="28"/>
+          <w:szCs w:val="28"/>
+        </w:rPr>
+        <w:t>his restricts how much data the container can write to its container layer (the thin writable layer on top of the image). If the container tries to exceed 5GB, writes will fail with “no space left on device”.</w:t>
       </w:r>
     </w:p>
     <w:p>
@@ -5805,7 +5850,45 @@
                                 <w:sz w:val="28"/>
                                 <w:szCs w:val="28"/>
                               </w:rPr>
-                              <w:t>Your root filesystem is XFS, /var/lib/docker lives on /, and you must enable project quotas at boot time using GRUB.</w:t>
+                              <w:t xml:space="preserve">Your root filesystem is XFS, </w:t>
+                            </w:r>
+                            <w:r>
+                              <w:rPr>
+                                <w:rFonts w:asciiTheme="majorBidi" w:hAnsiTheme="majorBidi" w:cstheme="majorBidi"/>
+                                <w:b/>
+                                <w:bCs/>
+                                <w:i/>
+                                <w:iCs/>
+                                <w:sz w:val="28"/>
+                                <w:szCs w:val="28"/>
+                              </w:rPr>
+                              <w:t>/var/lib/docker</w:t>
+                            </w:r>
+                            <w:r>
+                              <w:rPr>
+                                <w:rFonts w:asciiTheme="majorBidi" w:hAnsiTheme="majorBidi" w:cstheme="majorBidi"/>
+                                <w:sz w:val="28"/>
+                                <w:szCs w:val="28"/>
+                              </w:rPr>
+                              <w:t xml:space="preserve"> lives on </w:t>
+                            </w:r>
+                            <w:r>
+                              <w:rPr>
+                                <w:rFonts w:asciiTheme="majorBidi" w:hAnsiTheme="majorBidi" w:cstheme="majorBidi"/>
+                                <w:b/>
+                                <w:bCs/>
+                                <w:sz w:val="28"/>
+                                <w:szCs w:val="28"/>
+                              </w:rPr>
+                              <w:t>/</w:t>
+                            </w:r>
+                            <w:r>
+                              <w:rPr>
+                                <w:rFonts w:asciiTheme="majorBidi" w:hAnsiTheme="majorBidi" w:cstheme="majorBidi"/>
+                                <w:sz w:val="28"/>
+                                <w:szCs w:val="28"/>
+                              </w:rPr>
+                              <w:t>, and you must enable project quotas at boot time using GRUB.</w:t>
                             </w:r>
                           </w:p>
                           <w:p>
@@ -7150,7 +7233,45 @@
                           <w:sz w:val="28"/>
                           <w:szCs w:val="28"/>
                         </w:rPr>
-                        <w:t>Your root filesystem is XFS, /var/lib/docker lives on /, and you must enable project quotas at boot time using GRUB.</w:t>
+                        <w:t xml:space="preserve">Your root filesystem is XFS, </w:t>
+                      </w:r>
+                      <w:r>
+                        <w:rPr>
+                          <w:rFonts w:asciiTheme="majorBidi" w:hAnsiTheme="majorBidi" w:cstheme="majorBidi"/>
+                          <w:b/>
+                          <w:bCs/>
+                          <w:i/>
+                          <w:iCs/>
+                          <w:sz w:val="28"/>
+                          <w:szCs w:val="28"/>
+                        </w:rPr>
+                        <w:t>/var/lib/docker</w:t>
+                      </w:r>
+                      <w:r>
+                        <w:rPr>
+                          <w:rFonts w:asciiTheme="majorBidi" w:hAnsiTheme="majorBidi" w:cstheme="majorBidi"/>
+                          <w:sz w:val="28"/>
+                          <w:szCs w:val="28"/>
+                        </w:rPr>
+                        <w:t xml:space="preserve"> lives on </w:t>
+                      </w:r>
+                      <w:r>
+                        <w:rPr>
+                          <w:rFonts w:asciiTheme="majorBidi" w:hAnsiTheme="majorBidi" w:cstheme="majorBidi"/>
+                          <w:b/>
+                          <w:bCs/>
+                          <w:sz w:val="28"/>
+                          <w:szCs w:val="28"/>
+                        </w:rPr>
+                        <w:t>/</w:t>
+                      </w:r>
+                      <w:r>
+                        <w:rPr>
+                          <w:rFonts w:asciiTheme="majorBidi" w:hAnsiTheme="majorBidi" w:cstheme="majorBidi"/>
+                          <w:sz w:val="28"/>
+                          <w:szCs w:val="28"/>
+                        </w:rPr>
+                        <w:t>, and you must enable project quotas at boot time using GRUB.</w:t>
                       </w:r>
                     </w:p>
                     <w:p>
@@ -12442,13 +12563,21 @@
         <w:ind w:left="360"/>
         <w:rPr>
           <w:rFonts w:asciiTheme="majorBidi" w:hAnsiTheme="majorBidi" w:cstheme="majorBidi"/>
-          <w:sz w:val="28"/>
-          <w:szCs w:val="28"/>
-        </w:rPr>
-      </w:pPr>
-      <w:r>
-        <w:rPr>
-          <w:rFonts w:asciiTheme="majorBidi" w:hAnsiTheme="majorBidi" w:cstheme="majorBidi"/>
+          <w:b/>
+          <w:bCs/>
+          <w:i/>
+          <w:iCs/>
+          <w:sz w:val="28"/>
+          <w:szCs w:val="28"/>
+        </w:rPr>
+      </w:pPr>
+      <w:r>
+        <w:rPr>
+          <w:rFonts w:asciiTheme="majorBidi" w:hAnsiTheme="majorBidi" w:cstheme="majorBidi"/>
+          <w:b/>
+          <w:bCs/>
+          <w:i/>
+          <w:iCs/>
           <w:sz w:val="28"/>
           <w:szCs w:val="28"/>
         </w:rPr>
@@ -12458,6 +12587,10 @@
       <w:r>
         <w:rPr>
           <w:rFonts w:asciiTheme="majorBidi" w:hAnsiTheme="majorBidi" w:cstheme="majorBidi"/>
+          <w:b/>
+          <w:bCs/>
+          <w:i/>
+          <w:iCs/>
           <w:sz w:val="28"/>
           <w:szCs w:val="28"/>
         </w:rPr>
@@ -12475,13 +12608,21 @@
         <w:ind w:left="360"/>
         <w:rPr>
           <w:rFonts w:asciiTheme="majorBidi" w:hAnsiTheme="majorBidi" w:cstheme="majorBidi"/>
-          <w:sz w:val="28"/>
-          <w:szCs w:val="28"/>
-        </w:rPr>
-      </w:pPr>
-      <w:r>
-        <w:rPr>
-          <w:rFonts w:asciiTheme="majorBidi" w:hAnsiTheme="majorBidi" w:cstheme="majorBidi"/>
+          <w:b/>
+          <w:bCs/>
+          <w:i/>
+          <w:iCs/>
+          <w:sz w:val="28"/>
+          <w:szCs w:val="28"/>
+        </w:rPr>
+      </w:pPr>
+      <w:r>
+        <w:rPr>
+          <w:rFonts w:asciiTheme="majorBidi" w:hAnsiTheme="majorBidi" w:cstheme="majorBidi"/>
+          <w:b/>
+          <w:bCs/>
+          <w:i/>
+          <w:iCs/>
           <w:sz w:val="28"/>
           <w:szCs w:val="28"/>
         </w:rPr>
@@ -12491,6 +12632,10 @@
       <w:r>
         <w:rPr>
           <w:rFonts w:asciiTheme="majorBidi" w:hAnsiTheme="majorBidi" w:cstheme="majorBidi"/>
+          <w:b/>
+          <w:bCs/>
+          <w:i/>
+          <w:iCs/>
           <w:sz w:val="28"/>
           <w:szCs w:val="28"/>
         </w:rPr>
@@ -13129,13 +13274,15 @@
           <w:rFonts w:asciiTheme="majorBidi" w:hAnsiTheme="majorBidi" w:cstheme="majorBidi"/>
           <w:sz w:val="28"/>
           <w:szCs w:val="28"/>
-        </w:rPr>
-      </w:pPr>
-      <w:r>
-        <w:rPr>
-          <w:rFonts w:asciiTheme="majorBidi" w:hAnsiTheme="majorBidi" w:cstheme="majorBidi"/>
-          <w:sz w:val="28"/>
-          <w:szCs w:val="28"/>
+          <w:u w:val="single"/>
+        </w:rPr>
+      </w:pPr>
+      <w:r>
+        <w:rPr>
+          <w:rFonts w:asciiTheme="majorBidi" w:hAnsiTheme="majorBidi" w:cstheme="majorBidi"/>
+          <w:sz w:val="28"/>
+          <w:szCs w:val="28"/>
+          <w:u w:val="single"/>
         </w:rPr>
         <w:t>What still exists during pause?</w:t>
       </w:r>
@@ -14157,10 +14304,22 @@
       <w:r>
         <w:rPr>
           <w:rFonts w:asciiTheme="majorBidi" w:hAnsiTheme="majorBidi" w:cstheme="majorBidi"/>
-          <w:sz w:val="28"/>
-          <w:szCs w:val="28"/>
-        </w:rPr>
-        <w:t>attach → reconnect to the main process</w:t>
+          <w:b/>
+          <w:bCs/>
+          <w:i/>
+          <w:iCs/>
+          <w:sz w:val="28"/>
+          <w:szCs w:val="28"/>
+        </w:rPr>
+        <w:t>attach</w:t>
+      </w:r>
+      <w:r>
+        <w:rPr>
+          <w:rFonts w:asciiTheme="majorBidi" w:hAnsiTheme="majorBidi" w:cstheme="majorBidi"/>
+          <w:sz w:val="28"/>
+          <w:szCs w:val="28"/>
+        </w:rPr>
+        <w:t xml:space="preserve"> → reconnect to the main process</w:t>
       </w:r>
     </w:p>
     <w:p>
@@ -14181,10 +14340,22 @@
       <w:r>
         <w:rPr>
           <w:rFonts w:asciiTheme="majorBidi" w:hAnsiTheme="majorBidi" w:cstheme="majorBidi"/>
-          <w:sz w:val="28"/>
-          <w:szCs w:val="28"/>
-        </w:rPr>
-        <w:t>exec → create a new process inside the container</w:t>
+          <w:b/>
+          <w:bCs/>
+          <w:i/>
+          <w:iCs/>
+          <w:sz w:val="28"/>
+          <w:szCs w:val="28"/>
+        </w:rPr>
+        <w:t>exec</w:t>
+      </w:r>
+      <w:r>
+        <w:rPr>
+          <w:rFonts w:asciiTheme="majorBidi" w:hAnsiTheme="majorBidi" w:cstheme="majorBidi"/>
+          <w:sz w:val="28"/>
+          <w:szCs w:val="28"/>
+        </w:rPr>
+        <w:t xml:space="preserve"> → create a new process inside the container</w:t>
       </w:r>
     </w:p>
     <w:p>
@@ -16626,10 +16797,22 @@
       <w:r>
         <w:rPr>
           <w:rFonts w:asciiTheme="majorBidi" w:hAnsiTheme="majorBidi" w:cstheme="majorBidi"/>
-          <w:sz w:val="28"/>
-          <w:szCs w:val="28"/>
-        </w:rPr>
-        <w:t xml:space="preserve">docker stats reads from </w:t>
+          <w:b/>
+          <w:bCs/>
+          <w:i/>
+          <w:iCs/>
+          <w:sz w:val="28"/>
+          <w:szCs w:val="28"/>
+        </w:rPr>
+        <w:t>docker stats</w:t>
+      </w:r>
+      <w:r>
+        <w:rPr>
+          <w:rFonts w:asciiTheme="majorBidi" w:hAnsiTheme="majorBidi" w:cstheme="majorBidi"/>
+          <w:sz w:val="28"/>
+          <w:szCs w:val="28"/>
+        </w:rPr>
+        <w:t xml:space="preserve"> reads from </w:t>
       </w:r>
       <w:proofErr w:type="spellStart"/>
       <w:r>
@@ -17776,7 +17959,7 @@
           <w:sz w:val="28"/>
           <w:szCs w:val="28"/>
         </w:rPr>
-        <w:t xml:space="preserve">The deep truth is this: A container is not an environment, </w:t>
+        <w:t xml:space="preserve">A container is not an environment, </w:t>
       </w:r>
       <w:proofErr w:type="gramStart"/>
       <w:r>
@@ -17794,7 +17977,7 @@
           <w:sz w:val="28"/>
           <w:szCs w:val="28"/>
         </w:rPr>
-        <w:t xml:space="preserve"> is a process tree rooted at PID 1. When that root process dies, the container dies. No mystery. Just Unix rules applied with </w:t>
+        <w:t xml:space="preserve"> is a process tree rooted at PID 1. When that root process dies, the container dies. No mystery. Just Unix rules applied with namespace isolation. </w:t>
       </w:r>
       <w:r>
         <w:rPr>
@@ -17803,7 +17986,7 @@
           <w:szCs w:val="28"/>
         </w:rPr>
         <w:lastRenderedPageBreak/>
-        <w:t>namespace isolation. Understanding that containers are process-centric rather than machine-centric is the conceptual shift that separates VM thinking from container thinking.</w:t>
+        <w:t>Understanding that containers are process-centric rather than machine-centric is the conceptual shift that separates VM thinking from container thinking.</w:t>
       </w:r>
     </w:p>
     <w:p>
@@ -18842,9 +19025,16 @@
           <w:sz w:val="28"/>
           <w:szCs w:val="28"/>
         </w:rPr>
-        <w:t xml:space="preserve">There is no central daemon that stays alive managing all </w:t>
-      </w:r>
-      <w:proofErr w:type="spellStart"/>
+        <w:t>There is no central daemon that stays alive managing all containers.</w:t>
+      </w:r>
+      <w:r>
+        <w:rPr>
+          <w:rFonts w:asciiTheme="majorBidi" w:hAnsiTheme="majorBidi" w:cstheme="majorBidi"/>
+          <w:sz w:val="28"/>
+          <w:szCs w:val="28"/>
+        </w:rPr>
+        <w:t xml:space="preserve"> </w:t>
+      </w:r>
       <w:proofErr w:type="gramStart"/>
       <w:r>
         <w:rPr>
@@ -18852,9 +19042,8 @@
           <w:sz w:val="28"/>
           <w:szCs w:val="28"/>
         </w:rPr>
-        <w:t>containers.Each</w:t>
-      </w:r>
-      <w:proofErr w:type="spellEnd"/>
+        <w:t>Each</w:t>
+      </w:r>
       <w:proofErr w:type="gramEnd"/>
       <w:r>
         <w:rPr>
@@ -21011,7 +21200,27 @@
           <w:sz w:val="28"/>
           <w:szCs w:val="28"/>
         </w:rPr>
-        <w:t xml:space="preserve"> to stop containers unless live restore is enabled.</w:t>
+        <w:t xml:space="preserve"> to stop containers unless </w:t>
+      </w:r>
+      <w:r>
+        <w:rPr>
+          <w:rFonts w:asciiTheme="majorBidi" w:hAnsiTheme="majorBidi" w:cstheme="majorBidi"/>
+          <w:b/>
+          <w:bCs/>
+          <w:i/>
+          <w:iCs/>
+          <w:sz w:val="28"/>
+          <w:szCs w:val="28"/>
+        </w:rPr>
+        <w:t>live restore</w:t>
+      </w:r>
+      <w:r>
+        <w:rPr>
+          <w:rFonts w:asciiTheme="majorBidi" w:hAnsiTheme="majorBidi" w:cstheme="majorBidi"/>
+          <w:sz w:val="28"/>
+          <w:szCs w:val="28"/>
+        </w:rPr>
+        <w:t xml:space="preserve"> is enabled.</w:t>
       </w:r>
     </w:p>
     <w:p>
@@ -21050,7 +21259,27 @@
           <w:sz w:val="28"/>
           <w:szCs w:val="28"/>
         </w:rPr>
-        <w:t>": true is enabled:</w:t>
+        <w:t>"</w:t>
+      </w:r>
+      <w:r>
+        <w:rPr>
+          <w:rFonts w:asciiTheme="majorBidi" w:hAnsiTheme="majorBidi" w:cstheme="majorBidi"/>
+          <w:b/>
+          <w:bCs/>
+          <w:i/>
+          <w:iCs/>
+          <w:sz w:val="28"/>
+          <w:szCs w:val="28"/>
+        </w:rPr>
+        <w:t xml:space="preserve">: true </w:t>
+      </w:r>
+      <w:r>
+        <w:rPr>
+          <w:rFonts w:asciiTheme="majorBidi" w:hAnsiTheme="majorBidi" w:cstheme="majorBidi"/>
+          <w:sz w:val="28"/>
+          <w:szCs w:val="28"/>
+        </w:rPr>
+        <w:t>is enabled:</w:t>
       </w:r>
     </w:p>
     <w:p>
@@ -21192,7 +21421,27 @@
           <w:sz w:val="28"/>
           <w:szCs w:val="28"/>
         </w:rPr>
-        <w:t xml:space="preserve">Even without live-restore, if </w:t>
+        <w:t xml:space="preserve">Even without </w:t>
+      </w:r>
+      <w:r>
+        <w:rPr>
+          <w:rFonts w:asciiTheme="majorBidi" w:hAnsiTheme="majorBidi" w:cstheme="majorBidi"/>
+          <w:b/>
+          <w:bCs/>
+          <w:i/>
+          <w:iCs/>
+          <w:sz w:val="28"/>
+          <w:szCs w:val="28"/>
+        </w:rPr>
+        <w:t>live-restore</w:t>
+      </w:r>
+      <w:r>
+        <w:rPr>
+          <w:rFonts w:asciiTheme="majorBidi" w:hAnsiTheme="majorBidi" w:cstheme="majorBidi"/>
+          <w:sz w:val="28"/>
+          <w:szCs w:val="28"/>
+        </w:rPr>
+        <w:t xml:space="preserve">, if </w:t>
       </w:r>
       <w:proofErr w:type="spellStart"/>
       <w:r>
@@ -21223,10 +21472,34 @@
       <w:r>
         <w:rPr>
           <w:rFonts w:asciiTheme="majorBidi" w:hAnsiTheme="majorBidi" w:cstheme="majorBidi"/>
-          <w:sz w:val="28"/>
-          <w:szCs w:val="28"/>
-        </w:rPr>
-        <w:t>Live restore guarantees graceful daemon restart behavior.</w:t>
+          <w:b/>
+          <w:bCs/>
+          <w:i/>
+          <w:iCs/>
+          <w:sz w:val="28"/>
+          <w:szCs w:val="28"/>
+        </w:rPr>
+        <w:t>l</w:t>
+      </w:r>
+      <w:r>
+        <w:rPr>
+          <w:rFonts w:asciiTheme="majorBidi" w:hAnsiTheme="majorBidi" w:cstheme="majorBidi"/>
+          <w:b/>
+          <w:bCs/>
+          <w:i/>
+          <w:iCs/>
+          <w:sz w:val="28"/>
+          <w:szCs w:val="28"/>
+        </w:rPr>
+        <w:t>ive restore</w:t>
+      </w:r>
+      <w:r>
+        <w:rPr>
+          <w:rFonts w:asciiTheme="majorBidi" w:hAnsiTheme="majorBidi" w:cstheme="majorBidi"/>
+          <w:sz w:val="28"/>
+          <w:szCs w:val="28"/>
+        </w:rPr>
+        <w:t xml:space="preserve"> guarantees graceful daemon restart behavior.</w:t>
       </w:r>
     </w:p>
     <w:p>
@@ -21386,10 +21659,58 @@
       <w:r>
         <w:rPr>
           <w:rFonts w:asciiTheme="majorBidi" w:hAnsiTheme="majorBidi" w:cstheme="majorBidi"/>
-          <w:sz w:val="28"/>
-          <w:szCs w:val="28"/>
-        </w:rPr>
-        <w:t xml:space="preserve">Live restore controls behavior at the </w:t>
+          <w:b/>
+          <w:bCs/>
+          <w:i/>
+          <w:iCs/>
+          <w:sz w:val="28"/>
+          <w:szCs w:val="28"/>
+        </w:rPr>
+        <w:t>l</w:t>
+      </w:r>
+      <w:r>
+        <w:rPr>
+          <w:rFonts w:asciiTheme="majorBidi" w:hAnsiTheme="majorBidi" w:cstheme="majorBidi"/>
+          <w:b/>
+          <w:bCs/>
+          <w:i/>
+          <w:iCs/>
+          <w:sz w:val="28"/>
+          <w:szCs w:val="28"/>
+        </w:rPr>
+        <w:t>ive</w:t>
+      </w:r>
+      <w:r>
+        <w:rPr>
+          <w:rFonts w:asciiTheme="majorBidi" w:hAnsiTheme="majorBidi" w:cstheme="majorBidi"/>
+          <w:b/>
+          <w:bCs/>
+          <w:i/>
+          <w:iCs/>
+          <w:sz w:val="28"/>
+          <w:szCs w:val="28"/>
+        </w:rPr>
+        <w:t>-</w:t>
+      </w:r>
+      <w:r>
+        <w:rPr>
+          <w:rFonts w:asciiTheme="majorBidi" w:hAnsiTheme="majorBidi" w:cstheme="majorBidi"/>
+          <w:b/>
+          <w:bCs/>
+          <w:i/>
+          <w:iCs/>
+          <w:sz w:val="28"/>
+          <w:szCs w:val="28"/>
+        </w:rPr>
+        <w:t>restore</w:t>
+      </w:r>
+      <w:r>
+        <w:rPr>
+          <w:rFonts w:asciiTheme="majorBidi" w:hAnsiTheme="majorBidi" w:cstheme="majorBidi"/>
+          <w:sz w:val="28"/>
+          <w:szCs w:val="28"/>
+        </w:rPr>
+        <w:t xml:space="preserve"> controls behavior at the </w:t>
       </w:r>
       <w:proofErr w:type="spellStart"/>
       <w:r>
@@ -21431,7 +21752,51 @@
           <w:sz w:val="28"/>
           <w:szCs w:val="28"/>
         </w:rPr>
-        <w:t>Without live restore: A controlled daemon restart may stop containers.</w:t>
+        <w:t xml:space="preserve">Without </w:t>
+      </w:r>
+      <w:r>
+        <w:rPr>
+          <w:rFonts w:asciiTheme="majorBidi" w:hAnsiTheme="majorBidi" w:cstheme="majorBidi"/>
+          <w:b/>
+          <w:bCs/>
+          <w:i/>
+          <w:iCs/>
+          <w:sz w:val="28"/>
+          <w:szCs w:val="28"/>
+        </w:rPr>
+        <w:t>live</w:t>
+      </w:r>
+      <w:r>
+        <w:rPr>
+          <w:rFonts w:asciiTheme="majorBidi" w:hAnsiTheme="majorBidi" w:cstheme="majorBidi"/>
+          <w:b/>
+          <w:bCs/>
+          <w:i/>
+          <w:iCs/>
+          <w:sz w:val="28"/>
+          <w:szCs w:val="28"/>
+        </w:rPr>
+        <w:t>-</w:t>
+      </w:r>
+      <w:r>
+        <w:rPr>
+          <w:rFonts w:asciiTheme="majorBidi" w:hAnsiTheme="majorBidi" w:cstheme="majorBidi"/>
+          <w:b/>
+          <w:bCs/>
+          <w:i/>
+          <w:iCs/>
+          <w:sz w:val="28"/>
+          <w:szCs w:val="28"/>
+        </w:rPr>
+        <w:t>restore</w:t>
+      </w:r>
+      <w:r>
+        <w:rPr>
+          <w:rFonts w:asciiTheme="majorBidi" w:hAnsiTheme="majorBidi" w:cstheme="majorBidi"/>
+          <w:sz w:val="28"/>
+          <w:szCs w:val="28"/>
+        </w:rPr>
+        <w:t>: A controlled daemon restart may stop containers.</w:t>
       </w:r>
     </w:p>
     <w:p>
@@ -21455,7 +21820,27 @@
           <w:sz w:val="28"/>
           <w:szCs w:val="28"/>
         </w:rPr>
-        <w:t>With live restore: Containers keep running during daemon restart.</w:t>
+        <w:t xml:space="preserve">With </w:t>
+      </w:r>
+      <w:r>
+        <w:rPr>
+          <w:rFonts w:asciiTheme="majorBidi" w:hAnsiTheme="majorBidi" w:cstheme="majorBidi"/>
+          <w:b/>
+          <w:bCs/>
+          <w:i/>
+          <w:iCs/>
+          <w:sz w:val="28"/>
+          <w:szCs w:val="28"/>
+        </w:rPr>
+        <w:t>live-restore</w:t>
+      </w:r>
+      <w:r>
+        <w:rPr>
+          <w:rFonts w:asciiTheme="majorBidi" w:hAnsiTheme="majorBidi" w:cstheme="majorBidi"/>
+          <w:sz w:val="28"/>
+          <w:szCs w:val="28"/>
+        </w:rPr>
+        <w:t>: Containers keep running during daemon restart.</w:t>
       </w:r>
     </w:p>
     <w:p>
@@ -23387,6 +23772,10 @@
       <w:r>
         <w:rPr>
           <w:rFonts w:asciiTheme="majorBidi" w:hAnsiTheme="majorBidi" w:cstheme="majorBidi"/>
+          <w:b/>
+          <w:bCs/>
+          <w:i/>
+          <w:iCs/>
           <w:sz w:val="28"/>
           <w:szCs w:val="28"/>
         </w:rPr>
@@ -23405,6 +23794,8 @@
       <w:r>
         <w:rPr>
           <w:rFonts w:asciiTheme="majorBidi" w:hAnsiTheme="majorBidi" w:cstheme="majorBidi"/>
+          <w:b/>
+          <w:bCs/>
           <w:sz w:val="28"/>
           <w:szCs w:val="28"/>
         </w:rPr>
@@ -23447,6 +23838,14 @@
         <w:t>daemonless</w:t>
       </w:r>
       <w:proofErr w:type="spellEnd"/>
+      <w:r>
+        <w:rPr>
+          <w:rFonts w:asciiTheme="majorBidi" w:hAnsiTheme="majorBidi" w:cstheme="majorBidi"/>
+          <w:sz w:val="28"/>
+          <w:szCs w:val="28"/>
+        </w:rPr>
+        <w:t>,</w:t>
+      </w:r>
       <w:r>
         <w:rPr>
           <w:rFonts w:asciiTheme="majorBidi" w:hAnsiTheme="majorBidi" w:cstheme="majorBidi"/>
@@ -24972,6 +25371,7 @@
     </w:p>
     <w:p>
       <w:pPr>
+        <w:spacing w:after="60"/>
         <w:rPr>
           <w:rFonts w:asciiTheme="majorBidi" w:hAnsiTheme="majorBidi" w:cstheme="majorBidi"/>
           <w:sz w:val="28"/>
@@ -25416,13 +25816,15 @@
           <w:rFonts w:asciiTheme="majorBidi" w:hAnsiTheme="majorBidi" w:cstheme="majorBidi"/>
           <w:sz w:val="28"/>
           <w:szCs w:val="28"/>
-        </w:rPr>
-      </w:pPr>
-      <w:r>
-        <w:rPr>
-          <w:rFonts w:asciiTheme="majorBidi" w:hAnsiTheme="majorBidi" w:cstheme="majorBidi"/>
-          <w:sz w:val="28"/>
-          <w:szCs w:val="28"/>
+          <w:u w:val="single"/>
+        </w:rPr>
+      </w:pPr>
+      <w:r>
+        <w:rPr>
+          <w:rFonts w:asciiTheme="majorBidi" w:hAnsiTheme="majorBidi" w:cstheme="majorBidi"/>
+          <w:sz w:val="28"/>
+          <w:szCs w:val="28"/>
+          <w:u w:val="single"/>
         </w:rPr>
         <w:t>Common drivers:</w:t>
       </w:r>
@@ -25527,7 +25929,6 @@
           <w:sz w:val="28"/>
           <w:szCs w:val="28"/>
         </w:rPr>
-        <w:lastRenderedPageBreak/>
         <w:t>journald</w:t>
       </w:r>
       <w:proofErr w:type="spellEnd"/>
@@ -25553,6 +25954,7 @@
           <w:sz w:val="28"/>
           <w:szCs w:val="28"/>
         </w:rPr>
+        <w:lastRenderedPageBreak/>
         <w:t>gelf</w:t>
       </w:r>
       <w:proofErr w:type="spellEnd"/>
@@ -26454,15 +26856,25 @@
     </w:p>
     <w:p>
       <w:pPr>
-        <w:rPr>
-          <w:rFonts w:asciiTheme="majorBidi" w:hAnsiTheme="majorBidi" w:cstheme="majorBidi"/>
-          <w:sz w:val="28"/>
-          <w:szCs w:val="28"/>
-        </w:rPr>
-      </w:pPr>
-      <w:r>
-        <w:rPr>
-          <w:rFonts w:asciiTheme="majorBidi" w:hAnsiTheme="majorBidi" w:cstheme="majorBidi"/>
+        <w:pStyle w:val="ListParagraph"/>
+        <w:numPr>
+          <w:ilvl w:val="0"/>
+          <w:numId w:val="103"/>
+        </w:numPr>
+        <w:ind w:left="360"/>
+        <w:rPr>
+          <w:rFonts w:asciiTheme="majorBidi" w:hAnsiTheme="majorBidi" w:cstheme="majorBidi"/>
+          <w:sz w:val="28"/>
+          <w:szCs w:val="28"/>
+        </w:rPr>
+      </w:pPr>
+      <w:r>
+        <w:rPr>
+          <w:rFonts w:asciiTheme="majorBidi" w:hAnsiTheme="majorBidi" w:cstheme="majorBidi"/>
+          <w:b/>
+          <w:bCs/>
+          <w:i/>
+          <w:iCs/>
           <w:sz w:val="28"/>
           <w:szCs w:val="28"/>
         </w:rPr>
@@ -26474,45 +26886,44 @@
           <w:sz w:val="28"/>
           <w:szCs w:val="28"/>
         </w:rPr>
-        <w:t xml:space="preserve"> </w:t>
-      </w:r>
-      <w:r>
-        <w:rPr>
-          <w:rFonts w:asciiTheme="majorBidi" w:hAnsiTheme="majorBidi" w:cstheme="majorBidi"/>
-          <w:sz w:val="28"/>
-          <w:szCs w:val="28"/>
-        </w:rPr>
-        <w:t>→ Select driver.</w:t>
-      </w:r>
-    </w:p>
-    <w:p>
-      <w:pPr>
-        <w:rPr>
-          <w:rFonts w:asciiTheme="majorBidi" w:hAnsiTheme="majorBidi" w:cstheme="majorBidi"/>
-          <w:sz w:val="28"/>
-          <w:szCs w:val="28"/>
-        </w:rPr>
-      </w:pPr>
-      <w:r>
-        <w:rPr>
-          <w:rFonts w:asciiTheme="majorBidi" w:hAnsiTheme="majorBidi" w:cstheme="majorBidi"/>
+        <w:t xml:space="preserve"> → Select driver.</w:t>
+      </w:r>
+    </w:p>
+    <w:p>
+      <w:pPr>
+        <w:pStyle w:val="ListParagraph"/>
+        <w:numPr>
+          <w:ilvl w:val="0"/>
+          <w:numId w:val="103"/>
+        </w:numPr>
+        <w:ind w:left="360"/>
+        <w:rPr>
+          <w:rFonts w:asciiTheme="majorBidi" w:hAnsiTheme="majorBidi" w:cstheme="majorBidi"/>
+          <w:sz w:val="28"/>
+          <w:szCs w:val="28"/>
+        </w:rPr>
+      </w:pPr>
+      <w:r>
+        <w:rPr>
+          <w:b/>
+          <w:bCs/>
+          <w:i/>
+          <w:iCs/>
           <w:noProof/>
-          <w:sz w:val="28"/>
-          <w:szCs w:val="28"/>
         </w:rPr>
         <mc:AlternateContent>
           <mc:Choice Requires="wps">
             <w:drawing>
-              <wp:anchor distT="0" distB="0" distL="114300" distR="114300" simplePos="0" relativeHeight="251663360" behindDoc="0" locked="0" layoutInCell="1" allowOverlap="1" wp14:anchorId="0667E880" wp14:editId="25C3399D">
+              <wp:anchor distT="0" distB="0" distL="114300" distR="114300" simplePos="0" relativeHeight="251663360" behindDoc="0" locked="0" layoutInCell="1" allowOverlap="1" wp14:anchorId="0667E880" wp14:editId="4281EBFE">
                 <wp:simplePos x="0" y="0"/>
                 <wp:positionH relativeFrom="column">
-                  <wp:posOffset>15240</wp:posOffset>
+                  <wp:posOffset>220980</wp:posOffset>
                 </wp:positionH>
                 <wp:positionV relativeFrom="paragraph">
-                  <wp:posOffset>305435</wp:posOffset>
+                  <wp:posOffset>306705</wp:posOffset>
                 </wp:positionV>
-                <wp:extent cx="2842260" cy="1280160"/>
-                <wp:effectExtent l="0" t="0" r="15240" b="15240"/>
+                <wp:extent cx="2141220" cy="1280160"/>
+                <wp:effectExtent l="0" t="0" r="11430" b="15240"/>
                 <wp:wrapNone/>
                 <wp:docPr id="1831092563" name="Rectangle 5"/>
                 <wp:cNvGraphicFramePr/>
@@ -26523,7 +26934,7 @@
                       <wps:spPr>
                         <a:xfrm>
                           <a:off x="0" y="0"/>
-                          <a:ext cx="2842260" cy="1280160"/>
+                          <a:ext cx="2141220" cy="1280160"/>
                         </a:xfrm>
                         <a:prstGeom prst="rect">
                           <a:avLst/>
@@ -26552,6 +26963,10 @@
                               <w:spacing w:after="0"/>
                               <w:rPr>
                                 <w:rFonts w:asciiTheme="majorBidi" w:hAnsiTheme="majorBidi" w:cstheme="majorBidi"/>
+                                <w:b/>
+                                <w:bCs/>
+                                <w:i/>
+                                <w:iCs/>
                                 <w:sz w:val="28"/>
                                 <w:szCs w:val="28"/>
                               </w:rPr>
@@ -26559,10 +26974,24 @@
                             <w:r>
                               <w:rPr>
                                 <w:rFonts w:asciiTheme="majorBidi" w:hAnsiTheme="majorBidi" w:cstheme="majorBidi"/>
+                                <w:b/>
+                                <w:bCs/>
+                                <w:i/>
+                                <w:iCs/>
                                 <w:sz w:val="28"/>
                                 <w:szCs w:val="28"/>
                               </w:rPr>
-                              <w:t>docker run \</w:t>
+                              <w:t>docker run</w:t>
+                            </w:r>
+                            <w:r>
+                              <w:rPr>
+                                <w:rFonts w:asciiTheme="majorBidi" w:hAnsiTheme="majorBidi" w:cstheme="majorBidi"/>
+                                <w:b/>
+                                <w:bCs/>
+                                <w:sz w:val="28"/>
+                                <w:szCs w:val="28"/>
+                              </w:rPr>
+                              <w:t xml:space="preserve"> \</w:t>
                             </w:r>
                           </w:p>
                           <w:p>
@@ -26570,6 +26999,10 @@
                               <w:spacing w:after="0"/>
                               <w:rPr>
                                 <w:rFonts w:asciiTheme="majorBidi" w:hAnsiTheme="majorBidi" w:cstheme="majorBidi"/>
+                                <w:b/>
+                                <w:bCs/>
+                                <w:i/>
+                                <w:iCs/>
                                 <w:sz w:val="28"/>
                                 <w:szCs w:val="28"/>
                               </w:rPr>
@@ -26577,6 +27010,10 @@
                             <w:r>
                               <w:rPr>
                                 <w:rFonts w:asciiTheme="majorBidi" w:hAnsiTheme="majorBidi" w:cstheme="majorBidi"/>
+                                <w:b/>
+                                <w:bCs/>
+                                <w:i/>
+                                <w:iCs/>
                                 <w:sz w:val="28"/>
                                 <w:szCs w:val="28"/>
                               </w:rPr>
@@ -26586,6 +27023,10 @@
                             <w:r>
                               <w:rPr>
                                 <w:rFonts w:asciiTheme="majorBidi" w:hAnsiTheme="majorBidi" w:cstheme="majorBidi"/>
+                                <w:b/>
+                                <w:bCs/>
+                                <w:i/>
+                                <w:iCs/>
                                 <w:sz w:val="28"/>
                                 <w:szCs w:val="28"/>
                               </w:rPr>
@@ -26595,10 +27036,24 @@
                             <w:r>
                               <w:rPr>
                                 <w:rFonts w:asciiTheme="majorBidi" w:hAnsiTheme="majorBidi" w:cstheme="majorBidi"/>
+                                <w:b/>
+                                <w:bCs/>
+                                <w:i/>
+                                <w:iCs/>
                                 <w:sz w:val="28"/>
                                 <w:szCs w:val="28"/>
                               </w:rPr>
-                              <w:t>-file \</w:t>
+                              <w:t>-file</w:t>
+                            </w:r>
+                            <w:r>
+                              <w:rPr>
+                                <w:rFonts w:asciiTheme="majorBidi" w:hAnsiTheme="majorBidi" w:cstheme="majorBidi"/>
+                                <w:b/>
+                                <w:bCs/>
+                                <w:sz w:val="28"/>
+                                <w:szCs w:val="28"/>
+                              </w:rPr>
+                              <w:t xml:space="preserve"> \</w:t>
                             </w:r>
                           </w:p>
                           <w:p>
@@ -26606,6 +27061,10 @@
                               <w:spacing w:after="0"/>
                               <w:rPr>
                                 <w:rFonts w:asciiTheme="majorBidi" w:hAnsiTheme="majorBidi" w:cstheme="majorBidi"/>
+                                <w:b/>
+                                <w:bCs/>
+                                <w:i/>
+                                <w:iCs/>
                                 <w:sz w:val="28"/>
                                 <w:szCs w:val="28"/>
                               </w:rPr>
@@ -26613,10 +27072,24 @@
                             <w:r>
                               <w:rPr>
                                 <w:rFonts w:asciiTheme="majorBidi" w:hAnsiTheme="majorBidi" w:cstheme="majorBidi"/>
+                                <w:b/>
+                                <w:bCs/>
+                                <w:i/>
+                                <w:iCs/>
                                 <w:sz w:val="28"/>
                                 <w:szCs w:val="28"/>
                               </w:rPr>
-                              <w:t xml:space="preserve">  --log-opt max-size=10m \</w:t>
+                              <w:t xml:space="preserve">  --log-opt max-size=10m</w:t>
+                            </w:r>
+                            <w:r>
+                              <w:rPr>
+                                <w:rFonts w:asciiTheme="majorBidi" w:hAnsiTheme="majorBidi" w:cstheme="majorBidi"/>
+                                <w:b/>
+                                <w:bCs/>
+                                <w:sz w:val="28"/>
+                                <w:szCs w:val="28"/>
+                              </w:rPr>
+                              <w:t xml:space="preserve"> \</w:t>
                             </w:r>
                           </w:p>
                           <w:p>
@@ -26624,6 +27097,10 @@
                               <w:spacing w:after="0"/>
                               <w:rPr>
                                 <w:rFonts w:asciiTheme="majorBidi" w:hAnsiTheme="majorBidi" w:cstheme="majorBidi"/>
+                                <w:b/>
+                                <w:bCs/>
+                                <w:i/>
+                                <w:iCs/>
                                 <w:sz w:val="28"/>
                                 <w:szCs w:val="28"/>
                               </w:rPr>
@@ -26631,10 +27108,24 @@
                             <w:r>
                               <w:rPr>
                                 <w:rFonts w:asciiTheme="majorBidi" w:hAnsiTheme="majorBidi" w:cstheme="majorBidi"/>
+                                <w:b/>
+                                <w:bCs/>
+                                <w:i/>
+                                <w:iCs/>
                                 <w:sz w:val="28"/>
                                 <w:szCs w:val="28"/>
                               </w:rPr>
-                              <w:t xml:space="preserve">  --log-opt max-file=3 \</w:t>
+                              <w:t xml:space="preserve">  --log-opt max-file=3</w:t>
+                            </w:r>
+                            <w:r>
+                              <w:rPr>
+                                <w:rFonts w:asciiTheme="majorBidi" w:hAnsiTheme="majorBidi" w:cstheme="majorBidi"/>
+                                <w:b/>
+                                <w:bCs/>
+                                <w:sz w:val="28"/>
+                                <w:szCs w:val="28"/>
+                              </w:rPr>
+                              <w:t xml:space="preserve"> \</w:t>
                             </w:r>
                           </w:p>
                           <w:p>
@@ -26642,6 +27133,10 @@
                               <w:spacing w:after="0"/>
                               <w:rPr>
                                 <w:rFonts w:asciiTheme="majorBidi" w:hAnsiTheme="majorBidi" w:cstheme="majorBidi"/>
+                                <w:b/>
+                                <w:bCs/>
+                                <w:i/>
+                                <w:iCs/>
                                 <w:sz w:val="28"/>
                                 <w:szCs w:val="28"/>
                               </w:rPr>
@@ -26649,6 +27144,10 @@
                             <w:r>
                               <w:rPr>
                                 <w:rFonts w:asciiTheme="majorBidi" w:hAnsiTheme="majorBidi" w:cstheme="majorBidi"/>
+                                <w:b/>
+                                <w:bCs/>
+                                <w:i/>
+                                <w:iCs/>
                                 <w:sz w:val="28"/>
                                 <w:szCs w:val="28"/>
                               </w:rPr>
@@ -26683,7 +27182,7 @@
           </mc:Choice>
           <mc:Fallback>
             <w:pict>
-              <v:rect w14:anchorId="0667E880" id="_x0000_s1031" style="position:absolute;margin-left:1.2pt;margin-top:24.05pt;width:223.8pt;height:100.8pt;z-index:251663360;visibility:visible;mso-wrap-style:square;mso-width-percent:0;mso-height-percent:0;mso-wrap-distance-left:9pt;mso-wrap-distance-top:0;mso-wrap-distance-right:9pt;mso-wrap-distance-bottom:0;mso-position-horizontal:absolute;mso-position-horizontal-relative:text;mso-position-vertical:absolute;mso-position-vertical-relative:text;mso-width-percent:0;mso-height-percent:0;mso-width-relative:margin;mso-height-relative:margin;v-text-anchor:middle" o:gfxdata="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" fillcolor="black [3200]" strokecolor="black [480]" strokeweight="1pt">
+              <v:rect w14:anchorId="0667E880" id="_x0000_s1031" style="position:absolute;left:0;text-align:left;margin-left:17.4pt;margin-top:24.15pt;width:168.6pt;height:100.8pt;z-index:251663360;visibility:visible;mso-wrap-style:square;mso-width-percent:0;mso-height-percent:0;mso-wrap-distance-left:9pt;mso-wrap-distance-top:0;mso-wrap-distance-right:9pt;mso-wrap-distance-bottom:0;mso-position-horizontal:absolute;mso-position-horizontal-relative:text;mso-position-vertical:absolute;mso-position-vertical-relative:text;mso-width-percent:0;mso-height-percent:0;mso-width-relative:margin;mso-height-relative:margin;v-text-anchor:middle" o:gfxdata="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" fillcolor="black [3200]" strokecolor="black [480]" strokeweight="1pt">
                 <v:textbox>
                   <w:txbxContent>
                     <w:p>
@@ -26691,6 +27190,10 @@
                         <w:spacing w:after="0"/>
                         <w:rPr>
                           <w:rFonts w:asciiTheme="majorBidi" w:hAnsiTheme="majorBidi" w:cstheme="majorBidi"/>
+                          <w:b/>
+                          <w:bCs/>
+                          <w:i/>
+                          <w:iCs/>
                           <w:sz w:val="28"/>
                           <w:szCs w:val="28"/>
                         </w:rPr>
@@ -26698,10 +27201,24 @@
                       <w:r>
                         <w:rPr>
                           <w:rFonts w:asciiTheme="majorBidi" w:hAnsiTheme="majorBidi" w:cstheme="majorBidi"/>
+                          <w:b/>
+                          <w:bCs/>
+                          <w:i/>
+                          <w:iCs/>
                           <w:sz w:val="28"/>
                           <w:szCs w:val="28"/>
                         </w:rPr>
-                        <w:t>docker run \</w:t>
+                        <w:t>docker run</w:t>
+                      </w:r>
+                      <w:r>
+                        <w:rPr>
+                          <w:rFonts w:asciiTheme="majorBidi" w:hAnsiTheme="majorBidi" w:cstheme="majorBidi"/>
+                          <w:b/>
+                          <w:bCs/>
+                          <w:sz w:val="28"/>
+                          <w:szCs w:val="28"/>
+                        </w:rPr>
+                        <w:t xml:space="preserve"> \</w:t>
                       </w:r>
                     </w:p>
                     <w:p>
@@ -26709,6 +27226,10 @@
                         <w:spacing w:after="0"/>
                         <w:rPr>
                           <w:rFonts w:asciiTheme="majorBidi" w:hAnsiTheme="majorBidi" w:cstheme="majorBidi"/>
+                          <w:b/>
+                          <w:bCs/>
+                          <w:i/>
+                          <w:iCs/>
                           <w:sz w:val="28"/>
                           <w:szCs w:val="28"/>
                         </w:rPr>
@@ -26716,6 +27237,10 @@
                       <w:r>
                         <w:rPr>
                           <w:rFonts w:asciiTheme="majorBidi" w:hAnsiTheme="majorBidi" w:cstheme="majorBidi"/>
+                          <w:b/>
+                          <w:bCs/>
+                          <w:i/>
+                          <w:iCs/>
                           <w:sz w:val="28"/>
                           <w:szCs w:val="28"/>
                         </w:rPr>
@@ -26725,6 +27250,10 @@
                       <w:r>
                         <w:rPr>
                           <w:rFonts w:asciiTheme="majorBidi" w:hAnsiTheme="majorBidi" w:cstheme="majorBidi"/>
+                          <w:b/>
+                          <w:bCs/>
+                          <w:i/>
+                          <w:iCs/>
                           <w:sz w:val="28"/>
                           <w:szCs w:val="28"/>
                         </w:rPr>
@@ -26734,10 +27263,24 @@
                       <w:r>
                         <w:rPr>
                           <w:rFonts w:asciiTheme="majorBidi" w:hAnsiTheme="majorBidi" w:cstheme="majorBidi"/>
+                          <w:b/>
+                          <w:bCs/>
+                          <w:i/>
+                          <w:iCs/>
                           <w:sz w:val="28"/>
                           <w:szCs w:val="28"/>
                         </w:rPr>
-                        <w:t>-file \</w:t>
+                        <w:t>-file</w:t>
+                      </w:r>
+                      <w:r>
+                        <w:rPr>
+                          <w:rFonts w:asciiTheme="majorBidi" w:hAnsiTheme="majorBidi" w:cstheme="majorBidi"/>
+                          <w:b/>
+                          <w:bCs/>
+                          <w:sz w:val="28"/>
+                          <w:szCs w:val="28"/>
+                        </w:rPr>
+                        <w:t xml:space="preserve"> \</w:t>
                       </w:r>
                     </w:p>
                     <w:p>
@@ -26745,6 +27288,10 @@
                         <w:spacing w:after="0"/>
                         <w:rPr>
                           <w:rFonts w:asciiTheme="majorBidi" w:hAnsiTheme="majorBidi" w:cstheme="majorBidi"/>
+                          <w:b/>
+                          <w:bCs/>
+                          <w:i/>
+                          <w:iCs/>
                           <w:sz w:val="28"/>
                           <w:szCs w:val="28"/>
                         </w:rPr>
@@ -26752,10 +27299,24 @@
                       <w:r>
                         <w:rPr>
                           <w:rFonts w:asciiTheme="majorBidi" w:hAnsiTheme="majorBidi" w:cstheme="majorBidi"/>
+                          <w:b/>
+                          <w:bCs/>
+                          <w:i/>
+                          <w:iCs/>
                           <w:sz w:val="28"/>
                           <w:szCs w:val="28"/>
                         </w:rPr>
-                        <w:t xml:space="preserve">  --log-opt max-size=10m \</w:t>
+                        <w:t xml:space="preserve">  --log-opt max-size=10m</w:t>
+                      </w:r>
+                      <w:r>
+                        <w:rPr>
+                          <w:rFonts w:asciiTheme="majorBidi" w:hAnsiTheme="majorBidi" w:cstheme="majorBidi"/>
+                          <w:b/>
+                          <w:bCs/>
+                          <w:sz w:val="28"/>
+                          <w:szCs w:val="28"/>
+                        </w:rPr>
+                        <w:t xml:space="preserve"> \</w:t>
                       </w:r>
                     </w:p>
                     <w:p>
@@ -26763,6 +27324,10 @@
                         <w:spacing w:after="0"/>
                         <w:rPr>
                           <w:rFonts w:asciiTheme="majorBidi" w:hAnsiTheme="majorBidi" w:cstheme="majorBidi"/>
+                          <w:b/>
+                          <w:bCs/>
+                          <w:i/>
+                          <w:iCs/>
                           <w:sz w:val="28"/>
                           <w:szCs w:val="28"/>
                         </w:rPr>
@@ -26770,10 +27335,24 @@
                       <w:r>
                         <w:rPr>
                           <w:rFonts w:asciiTheme="majorBidi" w:hAnsiTheme="majorBidi" w:cstheme="majorBidi"/>
+                          <w:b/>
+                          <w:bCs/>
+                          <w:i/>
+                          <w:iCs/>
                           <w:sz w:val="28"/>
                           <w:szCs w:val="28"/>
                         </w:rPr>
-                        <w:t xml:space="preserve">  --log-opt max-file=3 \</w:t>
+                        <w:t xml:space="preserve">  --log-opt max-file=3</w:t>
+                      </w:r>
+                      <w:r>
+                        <w:rPr>
+                          <w:rFonts w:asciiTheme="majorBidi" w:hAnsiTheme="majorBidi" w:cstheme="majorBidi"/>
+                          <w:b/>
+                          <w:bCs/>
+                          <w:sz w:val="28"/>
+                          <w:szCs w:val="28"/>
+                        </w:rPr>
+                        <w:t xml:space="preserve"> \</w:t>
                       </w:r>
                     </w:p>
                     <w:p>
@@ -26781,6 +27360,10 @@
                         <w:spacing w:after="0"/>
                         <w:rPr>
                           <w:rFonts w:asciiTheme="majorBidi" w:hAnsiTheme="majorBidi" w:cstheme="majorBidi"/>
+                          <w:b/>
+                          <w:bCs/>
+                          <w:i/>
+                          <w:iCs/>
                           <w:sz w:val="28"/>
                           <w:szCs w:val="28"/>
                         </w:rPr>
@@ -26788,6 +27371,10 @@
                       <w:r>
                         <w:rPr>
                           <w:rFonts w:asciiTheme="majorBidi" w:hAnsiTheme="majorBidi" w:cstheme="majorBidi"/>
+                          <w:b/>
+                          <w:bCs/>
+                          <w:i/>
+                          <w:iCs/>
                           <w:sz w:val="28"/>
                           <w:szCs w:val="28"/>
                         </w:rPr>
@@ -26810,6 +27397,10 @@
       <w:r>
         <w:rPr>
           <w:rFonts w:asciiTheme="majorBidi" w:hAnsiTheme="majorBidi" w:cstheme="majorBidi"/>
+          <w:b/>
+          <w:bCs/>
+          <w:i/>
+          <w:iCs/>
           <w:sz w:val="28"/>
           <w:szCs w:val="28"/>
         </w:rPr>
@@ -26821,31 +27412,7 @@
           <w:sz w:val="28"/>
           <w:szCs w:val="28"/>
         </w:rPr>
-        <w:t xml:space="preserve"> </w:t>
-      </w:r>
-      <w:r>
-        <w:rPr>
-          <w:rFonts w:asciiTheme="majorBidi" w:hAnsiTheme="majorBidi" w:cstheme="majorBidi"/>
-          <w:sz w:val="28"/>
-          <w:szCs w:val="28"/>
-        </w:rPr>
-        <w:t>→ Configure driver-specific options.</w:t>
-      </w:r>
-      <w:r>
-        <w:rPr>
-          <w:rFonts w:asciiTheme="majorBidi" w:hAnsiTheme="majorBidi" w:cstheme="majorBidi"/>
-          <w:sz w:val="28"/>
-          <w:szCs w:val="28"/>
-        </w:rPr>
-        <w:t xml:space="preserve"> </w:t>
-      </w:r>
-      <w:r>
-        <w:rPr>
-          <w:rFonts w:asciiTheme="majorBidi" w:hAnsiTheme="majorBidi" w:cstheme="majorBidi"/>
-          <w:sz w:val="28"/>
-          <w:szCs w:val="28"/>
-        </w:rPr>
-        <w:t>Example (limit log file size):</w:t>
+        <w:t xml:space="preserve"> → Configure driver-specific options. Example (limit log file size):</w:t>
       </w:r>
     </w:p>
     <w:p>
@@ -26886,6 +27453,7 @@
     </w:p>
     <w:p>
       <w:pPr>
+        <w:ind w:left="360"/>
         <w:rPr>
           <w:rFonts w:asciiTheme="majorBidi" w:hAnsiTheme="majorBidi" w:cstheme="majorBidi"/>
           <w:sz w:val="28"/>
@@ -26908,7 +27476,6 @@
           <w:ilvl w:val="0"/>
           <w:numId w:val="80"/>
         </w:numPr>
-        <w:ind w:left="360"/>
         <w:rPr>
           <w:rFonts w:asciiTheme="majorBidi" w:hAnsiTheme="majorBidi" w:cstheme="majorBidi"/>
           <w:sz w:val="28"/>
@@ -26931,7 +27498,6 @@
           <w:ilvl w:val="0"/>
           <w:numId w:val="80"/>
         </w:numPr>
-        <w:ind w:left="360"/>
         <w:rPr>
           <w:rFonts w:asciiTheme="majorBidi" w:hAnsiTheme="majorBidi" w:cstheme="majorBidi"/>
           <w:sz w:val="28"/>
@@ -26955,6 +27521,23 @@
           <w:numId w:val="80"/>
         </w:numPr>
         <w:spacing w:after="120"/>
+        <w:rPr>
+          <w:rFonts w:asciiTheme="majorBidi" w:hAnsiTheme="majorBidi" w:cstheme="majorBidi"/>
+          <w:sz w:val="28"/>
+          <w:szCs w:val="28"/>
+        </w:rPr>
+      </w:pPr>
+      <w:r>
+        <w:rPr>
+          <w:rFonts w:asciiTheme="majorBidi" w:hAnsiTheme="majorBidi" w:cstheme="majorBidi"/>
+          <w:sz w:val="28"/>
+          <w:szCs w:val="28"/>
+        </w:rPr>
+        <w:t>Prevent disk explosion</w:t>
+      </w:r>
+    </w:p>
+    <w:p>
+      <w:pPr>
         <w:ind w:left="360"/>
         <w:rPr>
           <w:rFonts w:asciiTheme="majorBidi" w:hAnsiTheme="majorBidi" w:cstheme="majorBidi"/>
@@ -26969,23 +27552,6 @@
           <w:szCs w:val="28"/>
         </w:rPr>
         <w:lastRenderedPageBreak/>
-        <w:t>Prevent disk explosion</w:t>
-      </w:r>
-    </w:p>
-    <w:p>
-      <w:pPr>
-        <w:rPr>
-          <w:rFonts w:asciiTheme="majorBidi" w:hAnsiTheme="majorBidi" w:cstheme="majorBidi"/>
-          <w:sz w:val="28"/>
-          <w:szCs w:val="28"/>
-        </w:rPr>
-      </w:pPr>
-      <w:r>
-        <w:rPr>
-          <w:rFonts w:asciiTheme="majorBidi" w:hAnsiTheme="majorBidi" w:cstheme="majorBidi"/>
-          <w:sz w:val="28"/>
-          <w:szCs w:val="28"/>
-        </w:rPr>
         <w:t>Without this, logs grow forever.</w:t>
       </w:r>
     </w:p>
@@ -28211,7 +28777,6 @@
           <w:sz w:val="28"/>
           <w:szCs w:val="28"/>
         </w:rPr>
-        <w:lastRenderedPageBreak/>
         <w:t xml:space="preserve">docker </w:t>
       </w:r>
       <w:proofErr w:type="spellStart"/>
@@ -28362,6 +28927,7 @@
           <w:sz w:val="28"/>
           <w:szCs w:val="28"/>
         </w:rPr>
+        <w:lastRenderedPageBreak/>
         <w:t>Exit Code 0</w:t>
       </w:r>
     </w:p>
@@ -29357,25 +29923,25 @@
           <w:sz w:val="28"/>
           <w:szCs w:val="28"/>
         </w:rPr>
+        <w:t>Exit Code 128</w:t>
+      </w:r>
+    </w:p>
+    <w:p>
+      <w:pPr>
+        <w:ind w:left="360"/>
+        <w:rPr>
+          <w:rFonts w:asciiTheme="majorBidi" w:hAnsiTheme="majorBidi" w:cstheme="majorBidi"/>
+          <w:sz w:val="28"/>
+          <w:szCs w:val="28"/>
+        </w:rPr>
+      </w:pPr>
+      <w:r>
+        <w:rPr>
+          <w:rFonts w:asciiTheme="majorBidi" w:hAnsiTheme="majorBidi" w:cstheme="majorBidi"/>
+          <w:sz w:val="28"/>
+          <w:szCs w:val="28"/>
+        </w:rPr>
         <w:lastRenderedPageBreak/>
-        <w:t>Exit Code 128</w:t>
-      </w:r>
-    </w:p>
-    <w:p>
-      <w:pPr>
-        <w:ind w:left="360"/>
-        <w:rPr>
-          <w:rFonts w:asciiTheme="majorBidi" w:hAnsiTheme="majorBidi" w:cstheme="majorBidi"/>
-          <w:sz w:val="28"/>
-          <w:szCs w:val="28"/>
-        </w:rPr>
-      </w:pPr>
-      <w:r>
-        <w:rPr>
-          <w:rFonts w:asciiTheme="majorBidi" w:hAnsiTheme="majorBidi" w:cstheme="majorBidi"/>
-          <w:sz w:val="28"/>
-          <w:szCs w:val="28"/>
-        </w:rPr>
         <w:t>Invalid exit when a process terminates unexpectedly.</w:t>
       </w:r>
       <w:r>
@@ -30299,23 +30865,7 @@
           <w:sz w:val="28"/>
           <w:szCs w:val="28"/>
         </w:rPr>
-        <w:t>Docker tracks the main process (PID 1) in the container.</w:t>
-      </w:r>
-      <w:r>
-        <w:rPr>
-          <w:rFonts w:asciiTheme="majorBidi" w:hAnsiTheme="majorBidi" w:cstheme="majorBidi"/>
-          <w:sz w:val="28"/>
-          <w:szCs w:val="28"/>
-        </w:rPr>
-        <w:t xml:space="preserve"> </w:t>
-      </w:r>
-      <w:r>
-        <w:rPr>
-          <w:rFonts w:asciiTheme="majorBidi" w:hAnsiTheme="majorBidi" w:cstheme="majorBidi"/>
-          <w:sz w:val="28"/>
-          <w:szCs w:val="28"/>
-        </w:rPr>
-        <w:t>When PID 1 exits:</w:t>
+        <w:t>Docker tracks the main process (PID 1) in the container. When PID 1 exits:</w:t>
       </w:r>
     </w:p>
     <w:p>
@@ -30362,7 +30912,6 @@
           <w:sz w:val="28"/>
           <w:szCs w:val="28"/>
         </w:rPr>
-        <w:lastRenderedPageBreak/>
         <w:t>exit code is returned to Docker</w:t>
       </w:r>
     </w:p>
@@ -30382,6 +30931,7 @@
           <w:sz w:val="28"/>
           <w:szCs w:val="28"/>
         </w:rPr>
+        <w:lastRenderedPageBreak/>
         <w:t>Example:</w:t>
       </w:r>
     </w:p>
@@ -39288,6 +39838,119 @@
     </w:lvl>
   </w:abstractNum>
   <w:abstractNum w:abstractNumId="77" w15:restartNumberingAfterBreak="0">
+    <w:nsid w:val="5F910EB1"/>
+    <w:multiLevelType w:val="hybridMultilevel"/>
+    <w:tmpl w:val="95D0CE0C"/>
+    <w:lvl w:ilvl="0" w:tplc="04090001">
+      <w:start w:val="1"/>
+      <w:numFmt w:val="bullet"/>
+      <w:lvlText w:val=""/>
+      <w:lvlJc w:val="left"/>
+      <w:pPr>
+        <w:ind w:left="720" w:hanging="360"/>
+      </w:pPr>
+      <w:rPr>
+        <w:rFonts w:ascii="Symbol" w:hAnsi="Symbol" w:hint="default"/>
+      </w:rPr>
+    </w:lvl>
+    <w:lvl w:ilvl="1" w:tplc="04090003" w:tentative="1">
+      <w:start w:val="1"/>
+      <w:numFmt w:val="bullet"/>
+      <w:lvlText w:val="o"/>
+      <w:lvlJc w:val="left"/>
+      <w:pPr>
+        <w:ind w:left="1440" w:hanging="360"/>
+      </w:pPr>
+      <w:rPr>
+        <w:rFonts w:ascii="Courier New" w:hAnsi="Courier New" w:cs="Courier New" w:hint="default"/>
+      </w:rPr>
+    </w:lvl>
+    <w:lvl w:ilvl="2" w:tplc="04090005" w:tentative="1">
+      <w:start w:val="1"/>
+      <w:numFmt w:val="bullet"/>
+      <w:lvlText w:val=""/>
+      <w:lvlJc w:val="left"/>
+      <w:pPr>
+        <w:ind w:left="2160" w:hanging="360"/>
+      </w:pPr>
+      <w:rPr>
+        <w:rFonts w:ascii="Wingdings" w:hAnsi="Wingdings" w:hint="default"/>
+      </w:rPr>
+    </w:lvl>
+    <w:lvl w:ilvl="3" w:tplc="04090001" w:tentative="1">
+      <w:start w:val="1"/>
+      <w:numFmt w:val="bullet"/>
+      <w:lvlText w:val=""/>
+      <w:lvlJc w:val="left"/>
+      <w:pPr>
+        <w:ind w:left="2880" w:hanging="360"/>
+      </w:pPr>
+      <w:rPr>
+        <w:rFonts w:ascii="Symbol" w:hAnsi="Symbol" w:hint="default"/>
+      </w:rPr>
+    </w:lvl>
+    <w:lvl w:ilvl="4" w:tplc="04090003" w:tentative="1">
+      <w:start w:val="1"/>
+      <w:numFmt w:val="bullet"/>
+      <w:lvlText w:val="o"/>
+      <w:lvlJc w:val="left"/>
+      <w:pPr>
+        <w:ind w:left="3600" w:hanging="360"/>
+      </w:pPr>
+      <w:rPr>
+        <w:rFonts w:ascii="Courier New" w:hAnsi="Courier New" w:cs="Courier New" w:hint="default"/>
+      </w:rPr>
+    </w:lvl>
+    <w:lvl w:ilvl="5" w:tplc="04090005" w:tentative="1">
+      <w:start w:val="1"/>
+      <w:numFmt w:val="bullet"/>
+      <w:lvlText w:val=""/>
+      <w:lvlJc w:val="left"/>
+      <w:pPr>
+        <w:ind w:left="4320" w:hanging="360"/>
+      </w:pPr>
+      <w:rPr>
+        <w:rFonts w:ascii="Wingdings" w:hAnsi="Wingdings" w:hint="default"/>
+      </w:rPr>
+    </w:lvl>
+    <w:lvl w:ilvl="6" w:tplc="04090001" w:tentative="1">
+      <w:start w:val="1"/>
+      <w:numFmt w:val="bullet"/>
+      <w:lvlText w:val=""/>
+      <w:lvlJc w:val="left"/>
+      <w:pPr>
+        <w:ind w:left="5040" w:hanging="360"/>
+      </w:pPr>
+      <w:rPr>
+        <w:rFonts w:ascii="Symbol" w:hAnsi="Symbol" w:hint="default"/>
+      </w:rPr>
+    </w:lvl>
+    <w:lvl w:ilvl="7" w:tplc="04090003" w:tentative="1">
+      <w:start w:val="1"/>
+      <w:numFmt w:val="bullet"/>
+      <w:lvlText w:val="o"/>
+      <w:lvlJc w:val="left"/>
+      <w:pPr>
+        <w:ind w:left="5760" w:hanging="360"/>
+      </w:pPr>
+      <w:rPr>
+        <w:rFonts w:ascii="Courier New" w:hAnsi="Courier New" w:cs="Courier New" w:hint="default"/>
+      </w:rPr>
+    </w:lvl>
+    <w:lvl w:ilvl="8" w:tplc="04090005" w:tentative="1">
+      <w:start w:val="1"/>
+      <w:numFmt w:val="bullet"/>
+      <w:lvlText w:val=""/>
+      <w:lvlJc w:val="left"/>
+      <w:pPr>
+        <w:ind w:left="6480" w:hanging="360"/>
+      </w:pPr>
+      <w:rPr>
+        <w:rFonts w:ascii="Wingdings" w:hAnsi="Wingdings" w:hint="default"/>
+      </w:rPr>
+    </w:lvl>
+  </w:abstractNum>
+  <w:abstractNum w:abstractNumId="78" w15:restartNumberingAfterBreak="0">
     <w:nsid w:val="601C6D6E"/>
     <w:multiLevelType w:val="hybridMultilevel"/>
     <w:tmpl w:val="E6A8793C"/>
@@ -39400,7 +40063,7 @@
       </w:rPr>
     </w:lvl>
   </w:abstractNum>
-  <w:abstractNum w:abstractNumId="78" w15:restartNumberingAfterBreak="0">
+  <w:abstractNum w:abstractNumId="79" w15:restartNumberingAfterBreak="0">
     <w:nsid w:val="60224FA5"/>
     <w:multiLevelType w:val="hybridMultilevel"/>
     <w:tmpl w:val="7CE4CD1A"/>
@@ -39513,7 +40176,7 @@
       </w:rPr>
     </w:lvl>
   </w:abstractNum>
-  <w:abstractNum w:abstractNumId="79" w15:restartNumberingAfterBreak="0">
+  <w:abstractNum w:abstractNumId="80" w15:restartNumberingAfterBreak="0">
     <w:nsid w:val="626B6AB0"/>
     <w:multiLevelType w:val="hybridMultilevel"/>
     <w:tmpl w:val="5B38FD5E"/>
@@ -39599,7 +40262,7 @@
       </w:pPr>
     </w:lvl>
   </w:abstractNum>
-  <w:abstractNum w:abstractNumId="80" w15:restartNumberingAfterBreak="0">
+  <w:abstractNum w:abstractNumId="81" w15:restartNumberingAfterBreak="0">
     <w:nsid w:val="63520FCD"/>
     <w:multiLevelType w:val="hybridMultilevel"/>
     <w:tmpl w:val="BC20B65E"/>
@@ -39712,7 +40375,7 @@
       </w:rPr>
     </w:lvl>
   </w:abstractNum>
-  <w:abstractNum w:abstractNumId="81" w15:restartNumberingAfterBreak="0">
+  <w:abstractNum w:abstractNumId="82" w15:restartNumberingAfterBreak="0">
     <w:nsid w:val="655B111A"/>
     <w:multiLevelType w:val="hybridMultilevel"/>
     <w:tmpl w:val="9026927C"/>
@@ -39825,7 +40488,7 @@
       </w:rPr>
     </w:lvl>
   </w:abstractNum>
-  <w:abstractNum w:abstractNumId="82" w15:restartNumberingAfterBreak="0">
+  <w:abstractNum w:abstractNumId="83" w15:restartNumberingAfterBreak="0">
     <w:nsid w:val="67712598"/>
     <w:multiLevelType w:val="hybridMultilevel"/>
     <w:tmpl w:val="CF662074"/>
@@ -39938,7 +40601,7 @@
       </w:rPr>
     </w:lvl>
   </w:abstractNum>
-  <w:abstractNum w:abstractNumId="83" w15:restartNumberingAfterBreak="0">
+  <w:abstractNum w:abstractNumId="84" w15:restartNumberingAfterBreak="0">
     <w:nsid w:val="67D8184A"/>
     <w:multiLevelType w:val="hybridMultilevel"/>
     <w:tmpl w:val="18B8C9AC"/>
@@ -40051,7 +40714,7 @@
       </w:rPr>
     </w:lvl>
   </w:abstractNum>
-  <w:abstractNum w:abstractNumId="84" w15:restartNumberingAfterBreak="0">
+  <w:abstractNum w:abstractNumId="85" w15:restartNumberingAfterBreak="0">
     <w:nsid w:val="685F5CFD"/>
     <w:multiLevelType w:val="hybridMultilevel"/>
     <w:tmpl w:val="3C88BD80"/>
@@ -40164,7 +40827,7 @@
       </w:rPr>
     </w:lvl>
   </w:abstractNum>
-  <w:abstractNum w:abstractNumId="85" w15:restartNumberingAfterBreak="0">
+  <w:abstractNum w:abstractNumId="86" w15:restartNumberingAfterBreak="0">
     <w:nsid w:val="69E07337"/>
     <w:multiLevelType w:val="hybridMultilevel"/>
     <w:tmpl w:val="8BD25784"/>
@@ -40277,7 +40940,7 @@
       </w:rPr>
     </w:lvl>
   </w:abstractNum>
-  <w:abstractNum w:abstractNumId="86" w15:restartNumberingAfterBreak="0">
+  <w:abstractNum w:abstractNumId="87" w15:restartNumberingAfterBreak="0">
     <w:nsid w:val="6A921E1A"/>
     <w:multiLevelType w:val="hybridMultilevel"/>
     <w:tmpl w:val="EC482F82"/>
@@ -40390,7 +41053,7 @@
       </w:rPr>
     </w:lvl>
   </w:abstractNum>
-  <w:abstractNum w:abstractNumId="87" w15:restartNumberingAfterBreak="0">
+  <w:abstractNum w:abstractNumId="88" w15:restartNumberingAfterBreak="0">
     <w:nsid w:val="6A992E25"/>
     <w:multiLevelType w:val="hybridMultilevel"/>
     <w:tmpl w:val="FC0AD7D6"/>
@@ -40503,7 +41166,7 @@
       </w:rPr>
     </w:lvl>
   </w:abstractNum>
-  <w:abstractNum w:abstractNumId="88" w15:restartNumberingAfterBreak="0">
+  <w:abstractNum w:abstractNumId="89" w15:restartNumberingAfterBreak="0">
     <w:nsid w:val="6C0B2D42"/>
     <w:multiLevelType w:val="hybridMultilevel"/>
     <w:tmpl w:val="D8408682"/>
@@ -40616,7 +41279,7 @@
       </w:rPr>
     </w:lvl>
   </w:abstractNum>
-  <w:abstractNum w:abstractNumId="89" w15:restartNumberingAfterBreak="0">
+  <w:abstractNum w:abstractNumId="90" w15:restartNumberingAfterBreak="0">
     <w:nsid w:val="70B21A8E"/>
     <w:multiLevelType w:val="hybridMultilevel"/>
     <w:tmpl w:val="F0BA9A52"/>
@@ -40729,7 +41392,7 @@
       </w:rPr>
     </w:lvl>
   </w:abstractNum>
-  <w:abstractNum w:abstractNumId="90" w15:restartNumberingAfterBreak="0">
+  <w:abstractNum w:abstractNumId="91" w15:restartNumberingAfterBreak="0">
     <w:nsid w:val="71550F8E"/>
     <w:multiLevelType w:val="hybridMultilevel"/>
     <w:tmpl w:val="42147756"/>
@@ -40842,7 +41505,7 @@
       </w:rPr>
     </w:lvl>
   </w:abstractNum>
-  <w:abstractNum w:abstractNumId="91" w15:restartNumberingAfterBreak="0">
+  <w:abstractNum w:abstractNumId="92" w15:restartNumberingAfterBreak="0">
     <w:nsid w:val="717C6830"/>
     <w:multiLevelType w:val="hybridMultilevel"/>
     <w:tmpl w:val="9BC6839A"/>
@@ -40955,7 +41618,7 @@
       </w:rPr>
     </w:lvl>
   </w:abstractNum>
-  <w:abstractNum w:abstractNumId="92" w15:restartNumberingAfterBreak="0">
+  <w:abstractNum w:abstractNumId="93" w15:restartNumberingAfterBreak="0">
     <w:nsid w:val="73351920"/>
     <w:multiLevelType w:val="hybridMultilevel"/>
     <w:tmpl w:val="ACE4410C"/>
@@ -41068,7 +41731,7 @@
       </w:rPr>
     </w:lvl>
   </w:abstractNum>
-  <w:abstractNum w:abstractNumId="93" w15:restartNumberingAfterBreak="0">
+  <w:abstractNum w:abstractNumId="94" w15:restartNumberingAfterBreak="0">
     <w:nsid w:val="73EF5861"/>
     <w:multiLevelType w:val="hybridMultilevel"/>
     <w:tmpl w:val="F78A23CA"/>
@@ -41181,7 +41844,7 @@
       </w:rPr>
     </w:lvl>
   </w:abstractNum>
-  <w:abstractNum w:abstractNumId="94" w15:restartNumberingAfterBreak="0">
+  <w:abstractNum w:abstractNumId="95" w15:restartNumberingAfterBreak="0">
     <w:nsid w:val="747D26C2"/>
     <w:multiLevelType w:val="hybridMultilevel"/>
     <w:tmpl w:val="585EA518"/>
@@ -41294,7 +41957,7 @@
       </w:rPr>
     </w:lvl>
   </w:abstractNum>
-  <w:abstractNum w:abstractNumId="95" w15:restartNumberingAfterBreak="0">
+  <w:abstractNum w:abstractNumId="96" w15:restartNumberingAfterBreak="0">
     <w:nsid w:val="74BC1C1B"/>
     <w:multiLevelType w:val="hybridMultilevel"/>
     <w:tmpl w:val="DF3A32BC"/>
@@ -41407,7 +42070,7 @@
       </w:rPr>
     </w:lvl>
   </w:abstractNum>
-  <w:abstractNum w:abstractNumId="96" w15:restartNumberingAfterBreak="0">
+  <w:abstractNum w:abstractNumId="97" w15:restartNumberingAfterBreak="0">
     <w:nsid w:val="75A87DCB"/>
     <w:multiLevelType w:val="hybridMultilevel"/>
     <w:tmpl w:val="D5C8F8D4"/>
@@ -41520,7 +42183,7 @@
       </w:rPr>
     </w:lvl>
   </w:abstractNum>
-  <w:abstractNum w:abstractNumId="97" w15:restartNumberingAfterBreak="0">
+  <w:abstractNum w:abstractNumId="98" w15:restartNumberingAfterBreak="0">
     <w:nsid w:val="77E37EA2"/>
     <w:multiLevelType w:val="hybridMultilevel"/>
     <w:tmpl w:val="E3D4D084"/>
@@ -41633,7 +42296,7 @@
       </w:rPr>
     </w:lvl>
   </w:abstractNum>
-  <w:abstractNum w:abstractNumId="98" w15:restartNumberingAfterBreak="0">
+  <w:abstractNum w:abstractNumId="99" w15:restartNumberingAfterBreak="0">
     <w:nsid w:val="78BC10D4"/>
     <w:multiLevelType w:val="hybridMultilevel"/>
     <w:tmpl w:val="A934A256"/>
@@ -41746,7 +42409,7 @@
       </w:rPr>
     </w:lvl>
   </w:abstractNum>
-  <w:abstractNum w:abstractNumId="99" w15:restartNumberingAfterBreak="0">
+  <w:abstractNum w:abstractNumId="100" w15:restartNumberingAfterBreak="0">
     <w:nsid w:val="796144CD"/>
     <w:multiLevelType w:val="hybridMultilevel"/>
     <w:tmpl w:val="FBA6A9BE"/>
@@ -41859,7 +42522,7 @@
       </w:rPr>
     </w:lvl>
   </w:abstractNum>
-  <w:abstractNum w:abstractNumId="100" w15:restartNumberingAfterBreak="0">
+  <w:abstractNum w:abstractNumId="101" w15:restartNumberingAfterBreak="0">
     <w:nsid w:val="79F2025C"/>
     <w:multiLevelType w:val="hybridMultilevel"/>
     <w:tmpl w:val="856AB364"/>
@@ -41972,7 +42635,7 @@
       </w:rPr>
     </w:lvl>
   </w:abstractNum>
-  <w:abstractNum w:abstractNumId="101" w15:restartNumberingAfterBreak="0">
+  <w:abstractNum w:abstractNumId="102" w15:restartNumberingAfterBreak="0">
     <w:nsid w:val="7A880265"/>
     <w:multiLevelType w:val="hybridMultilevel"/>
     <w:tmpl w:val="00CE3C72"/>
@@ -42086,7 +42749,7 @@
     </w:lvl>
   </w:abstractNum>
   <w:num w:numId="1" w16cid:durableId="1476485022">
-    <w:abstractNumId w:val="95"/>
+    <w:abstractNumId w:val="96"/>
   </w:num>
   <w:num w:numId="2" w16cid:durableId="798887380">
     <w:abstractNumId w:val="34"/>
@@ -42095,10 +42758,10 @@
     <w:abstractNumId w:val="54"/>
   </w:num>
   <w:num w:numId="4" w16cid:durableId="1891963560">
-    <w:abstractNumId w:val="86"/>
+    <w:abstractNumId w:val="87"/>
   </w:num>
   <w:num w:numId="5" w16cid:durableId="337780777">
-    <w:abstractNumId w:val="85"/>
+    <w:abstractNumId w:val="86"/>
   </w:num>
   <w:num w:numId="6" w16cid:durableId="1319992471">
     <w:abstractNumId w:val="9"/>
@@ -42119,7 +42782,7 @@
     <w:abstractNumId w:val="66"/>
   </w:num>
   <w:num w:numId="12" w16cid:durableId="388262574">
-    <w:abstractNumId w:val="87"/>
+    <w:abstractNumId w:val="88"/>
   </w:num>
   <w:num w:numId="13" w16cid:durableId="1178665434">
     <w:abstractNumId w:val="63"/>
@@ -42140,7 +42803,7 @@
     <w:abstractNumId w:val="67"/>
   </w:num>
   <w:num w:numId="19" w16cid:durableId="590242007">
-    <w:abstractNumId w:val="88"/>
+    <w:abstractNumId w:val="89"/>
   </w:num>
   <w:num w:numId="20" w16cid:durableId="857157669">
     <w:abstractNumId w:val="35"/>
@@ -42158,7 +42821,7 @@
     <w:abstractNumId w:val="23"/>
   </w:num>
   <w:num w:numId="25" w16cid:durableId="2044283027">
-    <w:abstractNumId w:val="101"/>
+    <w:abstractNumId w:val="102"/>
   </w:num>
   <w:num w:numId="26" w16cid:durableId="1396320795">
     <w:abstractNumId w:val="17"/>
@@ -42173,7 +42836,7 @@
     <w:abstractNumId w:val="29"/>
   </w:num>
   <w:num w:numId="30" w16cid:durableId="41682562">
-    <w:abstractNumId w:val="78"/>
+    <w:abstractNumId w:val="79"/>
   </w:num>
   <w:num w:numId="31" w16cid:durableId="681009789">
     <w:abstractNumId w:val="15"/>
@@ -42182,25 +42845,25 @@
     <w:abstractNumId w:val="32"/>
   </w:num>
   <w:num w:numId="33" w16cid:durableId="267203936">
-    <w:abstractNumId w:val="82"/>
+    <w:abstractNumId w:val="83"/>
   </w:num>
   <w:num w:numId="34" w16cid:durableId="1364747124">
     <w:abstractNumId w:val="28"/>
   </w:num>
   <w:num w:numId="35" w16cid:durableId="465391243">
-    <w:abstractNumId w:val="80"/>
+    <w:abstractNumId w:val="81"/>
   </w:num>
   <w:num w:numId="36" w16cid:durableId="1051079903">
     <w:abstractNumId w:val="18"/>
   </w:num>
   <w:num w:numId="37" w16cid:durableId="1185172641">
-    <w:abstractNumId w:val="94"/>
+    <w:abstractNumId w:val="95"/>
   </w:num>
   <w:num w:numId="38" w16cid:durableId="762216263">
     <w:abstractNumId w:val="6"/>
   </w:num>
   <w:num w:numId="39" w16cid:durableId="523446550">
-    <w:abstractNumId w:val="84"/>
+    <w:abstractNumId w:val="85"/>
   </w:num>
   <w:num w:numId="40" w16cid:durableId="1654337723">
     <w:abstractNumId w:val="47"/>
@@ -42218,7 +42881,7 @@
     <w:abstractNumId w:val="73"/>
   </w:num>
   <w:num w:numId="45" w16cid:durableId="1962763530">
-    <w:abstractNumId w:val="90"/>
+    <w:abstractNumId w:val="91"/>
   </w:num>
   <w:num w:numId="46" w16cid:durableId="938829965">
     <w:abstractNumId w:val="76"/>
@@ -42248,13 +42911,13 @@
     <w:abstractNumId w:val="59"/>
   </w:num>
   <w:num w:numId="55" w16cid:durableId="1332876128">
-    <w:abstractNumId w:val="100"/>
+    <w:abstractNumId w:val="101"/>
   </w:num>
   <w:num w:numId="56" w16cid:durableId="1947536825">
     <w:abstractNumId w:val="42"/>
   </w:num>
   <w:num w:numId="57" w16cid:durableId="624190089">
-    <w:abstractNumId w:val="79"/>
+    <w:abstractNumId w:val="80"/>
   </w:num>
   <w:num w:numId="58" w16cid:durableId="1205942063">
     <w:abstractNumId w:val="44"/>
@@ -42275,13 +42938,13 @@
     <w:abstractNumId w:val="22"/>
   </w:num>
   <w:num w:numId="64" w16cid:durableId="1085298509">
-    <w:abstractNumId w:val="91"/>
+    <w:abstractNumId w:val="92"/>
   </w:num>
   <w:num w:numId="65" w16cid:durableId="594825755">
     <w:abstractNumId w:val="39"/>
   </w:num>
   <w:num w:numId="66" w16cid:durableId="963384137">
-    <w:abstractNumId w:val="93"/>
+    <w:abstractNumId w:val="94"/>
   </w:num>
   <w:num w:numId="67" w16cid:durableId="160971723">
     <w:abstractNumId w:val="21"/>
@@ -42290,13 +42953,13 @@
     <w:abstractNumId w:val="2"/>
   </w:num>
   <w:num w:numId="69" w16cid:durableId="740713111">
-    <w:abstractNumId w:val="97"/>
+    <w:abstractNumId w:val="98"/>
   </w:num>
   <w:num w:numId="70" w16cid:durableId="1256474621">
     <w:abstractNumId w:val="25"/>
   </w:num>
   <w:num w:numId="71" w16cid:durableId="647974055">
-    <w:abstractNumId w:val="89"/>
+    <w:abstractNumId w:val="90"/>
   </w:num>
   <w:num w:numId="72" w16cid:durableId="1371150596">
     <w:abstractNumId w:val="0"/>
@@ -42320,16 +42983,16 @@
     <w:abstractNumId w:val="26"/>
   </w:num>
   <w:num w:numId="79" w16cid:durableId="1355302869">
-    <w:abstractNumId w:val="83"/>
+    <w:abstractNumId w:val="84"/>
   </w:num>
   <w:num w:numId="80" w16cid:durableId="504127191">
     <w:abstractNumId w:val="37"/>
   </w:num>
   <w:num w:numId="81" w16cid:durableId="260987646">
-    <w:abstractNumId w:val="98"/>
+    <w:abstractNumId w:val="99"/>
   </w:num>
   <w:num w:numId="82" w16cid:durableId="1993102557">
-    <w:abstractNumId w:val="96"/>
+    <w:abstractNumId w:val="97"/>
   </w:num>
   <w:num w:numId="83" w16cid:durableId="772819709">
     <w:abstractNumId w:val="4"/>
@@ -42344,7 +43007,7 @@
     <w:abstractNumId w:val="14"/>
   </w:num>
   <w:num w:numId="87" w16cid:durableId="342242699">
-    <w:abstractNumId w:val="77"/>
+    <w:abstractNumId w:val="78"/>
   </w:num>
   <w:num w:numId="88" w16cid:durableId="1188984944">
     <w:abstractNumId w:val="38"/>
@@ -42359,7 +43022,7 @@
     <w:abstractNumId w:val="62"/>
   </w:num>
   <w:num w:numId="92" w16cid:durableId="766803225">
-    <w:abstractNumId w:val="99"/>
+    <w:abstractNumId w:val="100"/>
   </w:num>
   <w:num w:numId="93" w16cid:durableId="1935942845">
     <w:abstractNumId w:val="8"/>
@@ -42377,7 +43040,7 @@
     <w:abstractNumId w:val="75"/>
   </w:num>
   <w:num w:numId="98" w16cid:durableId="1193958668">
-    <w:abstractNumId w:val="81"/>
+    <w:abstractNumId w:val="82"/>
   </w:num>
   <w:num w:numId="99" w16cid:durableId="1347828190">
     <w:abstractNumId w:val="64"/>
@@ -42386,10 +43049,13 @@
     <w:abstractNumId w:val="36"/>
   </w:num>
   <w:num w:numId="101" w16cid:durableId="440032461">
-    <w:abstractNumId w:val="92"/>
+    <w:abstractNumId w:val="93"/>
   </w:num>
   <w:num w:numId="102" w16cid:durableId="1177574329">
     <w:abstractNumId w:val="68"/>
+  </w:num>
+  <w:num w:numId="103" w16cid:durableId="786967219">
+    <w:abstractNumId w:val="77"/>
   </w:num>
 </w:numbering>
 </file>

</xml_diff>